<commit_message>
Une partie « En CM2 » dans tous les dispositifs ; test CM2 3 + 3 ; renvois vers les documents triple niveau retirés
Co-Authored-By: Claude Opus 5.5 <noreply@anthropic.com>
Claude-Session: https://claude.ai/code/session_017QuRdkcjT4oVgGuiybp2K2
</commit_message>
<xml_diff>
--- a/Documents explicatifs des dispositifs/Dispositif3_Conjugaison_CM1_avec_jeux.docx
+++ b/Documents explicatifs des dispositifs/Dispositif3_Conjugaison_CM1_avec_jeux.docx
@@ -37,7 +37,7 @@
           <w:i/>
           <w:iCs/>
         </w:rPr>
-        <w:t>Préfixe retenu : C (Conjugaison). Version intégrant le jeu Profissime correspondant à chaque ceinture. Version triple niveau : document « Dispositif 3 — CE2-CM1-CM2 ».</w:t>
+        <w:t>Préfixe retenu : C (Conjugaison). Version intégrant le jeu Profissime correspondant à chaque ceinture. Pour le CM2 : voir la partie « En CM2 » à la fin de ce document.</w:t>
       </w:r>
     </w:p>
     <w:p>
@@ -1787,7 +1787,7 @@
         <w:t xml:space="preserve">Parcours</w:t>
       </w:r>
       <w:r>
-        <w:t xml:space="preserve"> : inchangé (Structure des ceintures) ; test ciblé A/B/C, réussite 6/6. Proposition : pour le CM2, 3 items sur le tronc commun et 3 items sur l’ajout CM2.</w:t>
+        <w:t xml:space="preserve"> : inchangé (Structure des ceintures) ; test ciblé A/B/C, réussite 6/6. Pour le CM2, chaque version du test compte 3 items sur le tronc commun et 3 items sur l’ajout CM2.</w:t>
       </w:r>
     </w:p>
     <w:p>

</xml_diff>